<commit_message>
Add GitHub code availability link and no-funding statement
</commit_message>
<xml_diff>
--- a/results/REVISION_SUBMISSION_PACKAGE_2026_06_29/01_Manuscript/Manuscript_NatureSubjournal_revised.docx
+++ b/results/REVISION_SUBMISSION_PACKAGE_2026_06_29/01_Manuscript/Manuscript_NatureSubjournal_revised.docx
@@ -1482,7 +1482,17 @@
         <w:jc w:val="both"/>
       </w:pPr>
       <w:r>
-        <w:t xml:space="preserve">The analysis code, processed source tables and figure-generation scripts will be made available for peer review at [GITHUB REVIEWER-ACCESS LINK TO BE ADDED AFTER REPOSITORY CREATION]. A permanent DOI-linked public repository will be released upon publication. The repository will include scripts for spatial preprocessing, module scoring, same-size random-core analyses, spatially contiguous random-core controls, anchor-component sensitivity, marker-overlap sensitivity, lymph-node leave-one-out analysis, NMF rank stability, Xenium validation, TCGA context analysis, figure generation and the panel-level plotting-code archive. A detailed local script and provenance index is maintained in </w:t>
+        <w:t xml:space="preserve">The analysis code, processed source tables and figure-generation scripts are staged for peer review in a private GitHub repository at </w:t>
+      </w:r>
+      <w:r>
+        <w:rPr>
+          <w:rFonts w:ascii="Consolas" w:hAnsi="Consolas"/>
+          <w:sz w:val="20"/>
+        </w:rPr>
+        <w:t>https://github.com/zzf617128/pdac_spatial_ecology</w:t>
+      </w:r>
+      <w:r>
+        <w:t xml:space="preserve">; reviewer access can be enabled during journal evaluation. A permanent DOI-linked public repository will be released upon publication. The repository includes scripts for spatial preprocessing, module scoring, same-size random-core analyses, spatially contiguous random-core controls, anchor-component sensitivity, marker-overlap sensitivity, lymph-node leave-one-out analysis, NMF rank stability, Xenium validation, TCGA context analysis, figure generation and the panel-level plotting-code archive. A detailed local script and provenance index is maintained in </w:t>
       </w:r>
       <w:r>
         <w:rPr>
@@ -1540,7 +1550,7 @@
         <w:jc w:val="both"/>
       </w:pPr>
       <w:r>
-        <w:t>Funding information was not provided in the current author-supplied metadata and should be completed by the authors before formal submission.</w:t>
+        <w:t>This research received no specific grant from any funding agency in the public, commercial or not-for-profit sectors.</w:t>
       </w:r>
     </w:p>
     <w:p>

</xml_diff>